<commit_message>
docs: condense project report and unify learning log and reflection essay into single document
</commit_message>
<xml_diff>
--- a/docs/Learning_Log.docx
+++ b/docs/Learning_Log.docx
@@ -44,7 +44,7 @@
           <w:color w:val="0F172A"/>
           <w:sz w:val="26"/>
         </w:rPr>
-        <w:t>LEARNING LOG: SELF-DIRECTED LIFELONG LEARNING (CO4, PO12)</w:t>
+        <w:t>LEARNING LOG &amp; REFLECTION ESSAY: SELF-DIRECTED LIFELONG LEARNING (CO4, PO12)</w:t>
         <w:br/>
         <w:t>Project: CampusEvents — RUET Campus Event Management System</w:t>
       </w:r>
@@ -267,7 +267,21 @@
           <w:color w:val="0F172A"/>
           <w:sz w:val="28"/>
         </w:rPr>
-        <w:t>1. Objectives &amp; Overview of Self-Directed Learning</w:t>
+        <w:t>Part I: Learning Log (Self-Directed Learning Records)</w:t>
+      </w:r>
+    </w:p>
+    <w:p>
+      <w:pPr>
+        <w:spacing w:before="160" w:after="60"/>
+      </w:pPr>
+      <w:r>
+        <w:rPr>
+          <w:rFonts w:ascii="Times New Roman" w:hAnsi="Times New Roman"/>
+          <w:b/>
+          <w:color w:val="1E293B"/>
+          <w:sz w:val="24"/>
+        </w:rPr>
+        <w:t>1. Overview of Self-Directed Learning</w:t>
       </w:r>
     </w:p>
     <w:p>
@@ -280,21 +294,21 @@
           <w:i w:val="0"/>
           <w:sz w:val="22"/>
         </w:rPr>
-        <w:t>In fulfillment of Course Outcome CO4 and Program Outcome PO12 (Recognizing the need for, and having the preparation and ability to engage in independent and lifelong learning in the broadest context of technological change), this Learning Log documents the self-directed acquisition of modern engineering methodologies outside the core sessional curriculum. Specifically, it chronicles the adoption of GitHub Projects for Agile sprint management, Test-Driven Development (TDD) using Vitest with external dependency mocks, and the practical implementation of GoF Design Patterns.</w:t>
+        <w:t>This Learning Log documents the self-directed acquisition of modern engineering methodologies outside the core sessional curriculum. Specifically, it chronicles the adoption of GitHub Projects for Agile sprint management, Test-Driven Development (TDD) using Vitest with external dependency mocks, and the practical implementation of GoF Design Patterns.</w:t>
       </w:r>
     </w:p>
     <w:p>
       <w:pPr>
-        <w:spacing w:before="240" w:after="80"/>
+        <w:spacing w:before="160" w:after="60"/>
       </w:pPr>
       <w:r>
         <w:rPr>
           <w:rFonts w:ascii="Times New Roman" w:hAnsi="Times New Roman"/>
           <w:b/>
-          <w:color w:val="0F172A"/>
-          <w:sz w:val="28"/>
+          <w:color w:val="1E293B"/>
+          <w:sz w:val="24"/>
         </w:rPr>
-        <w:t>2. Chronological Engineering Log &amp; Sprint Milestones</w:t>
+        <w:t>2. Chronological Engineering Log &amp; Sprint Milestones (Table 1)</w:t>
       </w:r>
     </w:p>
     <w:tbl>
@@ -313,7 +327,7 @@
       <w:tr>
         <w:tc>
           <w:tcPr>
-            <w:tcW w:type="dxa" w:w="1728"/>
+            <w:tcW w:type="dxa" w:w="1584"/>
             <w:shd w:fill="E2E8F0"/>
             <w:tcMar>
               <w:top w:w="80" w:type="dxa"/>
@@ -388,7 +402,7 @@
         </w:tc>
         <w:tc>
           <w:tcPr>
-            <w:tcW w:type="dxa" w:w="2160"/>
+            <w:tcW w:type="dxa" w:w="2304"/>
             <w:shd w:fill="E2E8F0"/>
             <w:tcMar>
               <w:top w:w="80" w:type="dxa"/>
@@ -415,7 +429,7 @@
       <w:tr>
         <w:tc>
           <w:tcPr>
-            <w:tcW w:type="dxa" w:w="1728"/>
+            <w:tcW w:type="dxa" w:w="1584"/>
             <w:shd w:fill="FFFFFF"/>
             <w:tcMar>
               <w:top w:w="60" w:type="dxa"/>
@@ -474,13 +488,13 @@
                 <w:rFonts w:ascii="Times New Roman" w:hAnsi="Times New Roman"/>
                 <w:sz w:val="19"/>
               </w:rPr>
-              <w:t>Researched project management alternatives beyond the syllabus. Compared Jira vs. Trello vs. GitHub Projects. Configured GitHub Projects beta with custom Kanban status fields (Backlog, Ready, In Progress, In Review, Done).</w:t>
+              <w:t>Researched project management alternatives beyond the syllabus. Compared Jira vs. Trello vs. GitHub Projects. Configured GitHub Projects with custom Kanban status fields (Backlog, Ready, In Progress, In Review, Done).</w:t>
             </w:r>
           </w:p>
         </w:tc>
         <w:tc>
           <w:tcPr>
-            <w:tcW w:type="dxa" w:w="2160"/>
+            <w:tcW w:type="dxa" w:w="2304"/>
             <w:shd w:fill="FFFFFF"/>
             <w:tcMar>
               <w:top w:w="60" w:type="dxa"/>
@@ -503,7 +517,7 @@
       <w:tr>
         <w:tc>
           <w:tcPr>
-            <w:tcW w:type="dxa" w:w="1728"/>
+            <w:tcW w:type="dxa" w:w="1584"/>
             <w:shd w:fill="F8FAFC"/>
             <w:tcMar>
               <w:top w:w="60" w:type="dxa"/>
@@ -568,7 +582,7 @@
         </w:tc>
         <w:tc>
           <w:tcPr>
-            <w:tcW w:type="dxa" w:w="2160"/>
+            <w:tcW w:type="dxa" w:w="2304"/>
             <w:shd w:fill="F8FAFC"/>
             <w:tcMar>
               <w:top w:w="60" w:type="dxa"/>
@@ -591,7 +605,7 @@
       <w:tr>
         <w:tc>
           <w:tcPr>
-            <w:tcW w:type="dxa" w:w="1728"/>
+            <w:tcW w:type="dxa" w:w="1584"/>
             <w:shd w:fill="FFFFFF"/>
             <w:tcMar>
               <w:top w:w="60" w:type="dxa"/>
@@ -656,7 +670,7 @@
         </w:tc>
         <w:tc>
           <w:tcPr>
-            <w:tcW w:type="dxa" w:w="2160"/>
+            <w:tcW w:type="dxa" w:w="2304"/>
             <w:shd w:fill="FFFFFF"/>
             <w:tcMar>
               <w:top w:w="60" w:type="dxa"/>
@@ -679,7 +693,7 @@
       <w:tr>
         <w:tc>
           <w:tcPr>
-            <w:tcW w:type="dxa" w:w="1728"/>
+            <w:tcW w:type="dxa" w:w="1584"/>
             <w:shd w:fill="F8FAFC"/>
             <w:tcMar>
               <w:top w:w="60" w:type="dxa"/>
@@ -738,13 +752,13 @@
                 <w:rFonts w:ascii="Times New Roman" w:hAnsi="Times New Roman"/>
                 <w:sz w:val="19"/>
               </w:rPr>
-              <w:t>Transitioned away from cumbersome legacy testing setups. Self-learned Vitest and v8 coverage. Implemented isolated mocks for Firebase Firestore methods (`getDocs`, `setDoc`, `updateDoc`).</w:t>
+              <w:t>Transitioned away from cumbersome legacy testing setups. Self-learned Vitest and v8 coverage. Implemented isolated mocks for Firebase Firestore methods (getDocs, setDoc, updateDoc).</w:t>
             </w:r>
           </w:p>
         </w:tc>
         <w:tc>
           <w:tcPr>
-            <w:tcW w:type="dxa" w:w="2160"/>
+            <w:tcW w:type="dxa" w:w="2304"/>
             <w:shd w:fill="F8FAFC"/>
             <w:tcMar>
               <w:top w:w="60" w:type="dxa"/>
@@ -767,7 +781,7 @@
       <w:tr>
         <w:tc>
           <w:tcPr>
-            <w:tcW w:type="dxa" w:w="1728"/>
+            <w:tcW w:type="dxa" w:w="1584"/>
             <w:shd w:fill="FFFFFF"/>
             <w:tcMar>
               <w:top w:w="60" w:type="dxa"/>
@@ -832,7 +846,7 @@
         </w:tc>
         <w:tc>
           <w:tcPr>
-            <w:tcW w:type="dxa" w:w="2160"/>
+            <w:tcW w:type="dxa" w:w="2304"/>
             <w:shd w:fill="FFFFFF"/>
             <w:tcMar>
               <w:top w:w="60" w:type="dxa"/>
@@ -855,7 +869,7 @@
       <w:tr>
         <w:tc>
           <w:tcPr>
-            <w:tcW w:type="dxa" w:w="1728"/>
+            <w:tcW w:type="dxa" w:w="1584"/>
             <w:shd w:fill="F8FAFC"/>
             <w:tcMar>
               <w:top w:w="60" w:type="dxa"/>
@@ -920,7 +934,7 @@
         </w:tc>
         <w:tc>
           <w:tcPr>
-            <w:tcW w:type="dxa" w:w="2160"/>
+            <w:tcW w:type="dxa" w:w="2304"/>
             <w:shd w:fill="F8FAFC"/>
             <w:tcMar>
               <w:top w:w="60" w:type="dxa"/>
@@ -948,20 +962,6 @@
     </w:p>
     <w:p>
       <w:pPr>
-        <w:spacing w:before="240" w:after="80"/>
-      </w:pPr>
-      <w:r>
-        <w:rPr>
-          <w:rFonts w:ascii="Times New Roman" w:hAnsi="Times New Roman"/>
-          <w:b/>
-          <w:color w:val="0F172A"/>
-          <w:sz w:val="28"/>
-        </w:rPr>
-        <w:t>3. Deep Technical Challenges &amp; Resolution Log</w:t>
-      </w:r>
-    </w:p>
-    <w:p>
-      <w:pPr>
         <w:spacing w:before="160" w:after="60"/>
       </w:pPr>
       <w:r>
@@ -971,238 +971,7 @@
           <w:color w:val="1E293B"/>
           <w:sz w:val="24"/>
         </w:rPr>
-        <w:t>Challenge 1: Cloud Firestore Network Coupling in Offline Test Suites</w:t>
-      </w:r>
-    </w:p>
-    <w:p>
-      <w:pPr>
-        <w:pStyle w:val="ListBullet"/>
-        <w:spacing w:line="276" w:lineRule="auto" w:after="40"/>
-      </w:pPr>
-      <w:r>
-        <w:rPr>
-          <w:rFonts w:ascii="Times New Roman" w:hAnsi="Times New Roman"/>
-          <w:b/>
-          <w:sz w:val="22"/>
-        </w:rPr>
-        <w:t>Problem Description:</w:t>
-      </w:r>
-      <w:r>
-        <w:rPr>
-          <w:rFonts w:ascii="Times New Roman" w:hAnsi="Times New Roman"/>
-          <w:sz w:val="22"/>
-        </w:rPr>
-        <w:t xml:space="preserve"> When executing automated unit tests, test suites attempted real HTTP connections to Firebase Firestore, failing when network latency spiked or during offline campus lab sessions.</w:t>
-      </w:r>
-    </w:p>
-    <w:p>
-      <w:pPr>
-        <w:pStyle w:val="ListBullet"/>
-        <w:spacing w:line="276" w:lineRule="auto" w:after="40"/>
-      </w:pPr>
-      <w:r>
-        <w:rPr>
-          <w:rFonts w:ascii="Times New Roman" w:hAnsi="Times New Roman"/>
-          <w:b/>
-          <w:sz w:val="22"/>
-        </w:rPr>
-        <w:t>Root Cause &amp; Resolution:</w:t>
-      </w:r>
-      <w:r>
-        <w:rPr>
-          <w:rFonts w:ascii="Times New Roman" w:hAnsi="Times New Roman"/>
-          <w:sz w:val="22"/>
-        </w:rPr>
-        <w:t xml:space="preserve"> Learned and applied Vitest module mocking via `vi.mock('firebase/firestore')`. Intercepted raw SDK queries with in-memory deterministic responses and engineered a dual-mode persistence fallback in `EventService` utilizing local storage.</w:t>
-      </w:r>
-    </w:p>
-    <w:p>
-      <w:pPr>
-        <w:pStyle w:val="ListBullet"/>
-        <w:spacing w:line="276" w:lineRule="auto" w:after="40"/>
-      </w:pPr>
-      <w:r>
-        <w:rPr>
-          <w:rFonts w:ascii="Times New Roman" w:hAnsi="Times New Roman"/>
-          <w:b/>
-          <w:sz w:val="22"/>
-        </w:rPr>
-        <w:t>Engineering Lesson:</w:t>
-      </w:r>
-      <w:r>
-        <w:rPr>
-          <w:rFonts w:ascii="Times New Roman" w:hAnsi="Times New Roman"/>
-          <w:sz w:val="22"/>
-        </w:rPr>
-        <w:t xml:space="preserve"> Decoupling domain services from persistence implementations is imperative for reproducible testing.</w:t>
-      </w:r>
-    </w:p>
-    <w:p>
-      <w:pPr>
-        <w:spacing w:before="160" w:after="60"/>
-      </w:pPr>
-      <w:r>
-        <w:rPr>
-          <w:rFonts w:ascii="Times New Roman" w:hAnsi="Times New Roman"/>
-          <w:b/>
-          <w:color w:val="1E293B"/>
-          <w:sz w:val="24"/>
-        </w:rPr>
-        <w:t>Challenge 2: State Synchronization Across Decoupled Components</w:t>
-      </w:r>
-    </w:p>
-    <w:p>
-      <w:pPr>
-        <w:pStyle w:val="ListBullet"/>
-        <w:spacing w:line="276" w:lineRule="auto" w:after="40"/>
-      </w:pPr>
-      <w:r>
-        <w:rPr>
-          <w:rFonts w:ascii="Times New Roman" w:hAnsi="Times New Roman"/>
-          <w:b/>
-          <w:sz w:val="22"/>
-        </w:rPr>
-        <w:t>Problem Description:</w:t>
-      </w:r>
-      <w:r>
-        <w:rPr>
-          <w:rFonts w:ascii="Times New Roman" w:hAnsi="Times New Roman"/>
-          <w:sz w:val="22"/>
-        </w:rPr>
-        <w:t xml:space="preserve"> Upon reserving an event ticket in the details modal, the card seat quota on the home page and the navbar ticket count badge failed to reflect the updated count without manually refreshing the browser.</w:t>
-      </w:r>
-    </w:p>
-    <w:p>
-      <w:pPr>
-        <w:pStyle w:val="ListBullet"/>
-        <w:spacing w:line="276" w:lineRule="auto" w:after="40"/>
-      </w:pPr>
-      <w:r>
-        <w:rPr>
-          <w:rFonts w:ascii="Times New Roman" w:hAnsi="Times New Roman"/>
-          <w:b/>
-          <w:sz w:val="22"/>
-        </w:rPr>
-        <w:t>Root Cause &amp; Resolution:</w:t>
-      </w:r>
-      <w:r>
-        <w:rPr>
-          <w:rFonts w:ascii="Times New Roman" w:hAnsi="Times New Roman"/>
-          <w:sz w:val="22"/>
-        </w:rPr>
-        <w:t xml:space="preserve"> Designed and implemented a centralized, lightweight publish-subscribe `EventBus` (Observer pattern). Wrapped subscriptions inside React's `useEffect` hook with dedicated unsubscriber cleanups, allowing components to reactively re-render upon `RSVP_CONFIRMED` broadcasts.</w:t>
-      </w:r>
-    </w:p>
-    <w:p>
-      <w:pPr>
-        <w:pStyle w:val="ListBullet"/>
-        <w:spacing w:line="276" w:lineRule="auto" w:after="40"/>
-      </w:pPr>
-      <w:r>
-        <w:rPr>
-          <w:rFonts w:ascii="Times New Roman" w:hAnsi="Times New Roman"/>
-          <w:b/>
-          <w:sz w:val="22"/>
-        </w:rPr>
-        <w:t>Engineering Lesson:</w:t>
-      </w:r>
-      <w:r>
-        <w:rPr>
-          <w:rFonts w:ascii="Times New Roman" w:hAnsi="Times New Roman"/>
-          <w:sz w:val="22"/>
-        </w:rPr>
-        <w:t xml:space="preserve"> Behavioral patterns provide clean, scalable event pipelines that preserve component decoupling.</w:t>
-      </w:r>
-    </w:p>
-    <w:p>
-      <w:pPr>
-        <w:spacing w:before="160" w:after="60"/>
-      </w:pPr>
-      <w:r>
-        <w:rPr>
-          <w:rFonts w:ascii="Times New Roman" w:hAnsi="Times New Roman"/>
-          <w:b/>
-          <w:color w:val="1E293B"/>
-          <w:sz w:val="24"/>
-        </w:rPr>
-        <w:t>Challenge 3: TDD Edge-Case Failure in Factory Validation</w:t>
-      </w:r>
-    </w:p>
-    <w:p>
-      <w:pPr>
-        <w:pStyle w:val="ListBullet"/>
-        <w:spacing w:line="276" w:lineRule="auto" w:after="40"/>
-      </w:pPr>
-      <w:r>
-        <w:rPr>
-          <w:rFonts w:ascii="Times New Roman" w:hAnsi="Times New Roman"/>
-          <w:b/>
-          <w:sz w:val="22"/>
-        </w:rPr>
-        <w:t>Problem Description:</w:t>
-      </w:r>
-      <w:r>
-        <w:rPr>
-          <w:rFonts w:ascii="Times New Roman" w:hAnsi="Times New Roman"/>
-          <w:sz w:val="22"/>
-        </w:rPr>
-        <w:t xml:space="preserve"> During TDD execution of `EventFactory.test.js`, the test verifying minimum sports team sizes failed unexpectedly when passed `teamSize: 0`.</w:t>
-      </w:r>
-    </w:p>
-    <w:p>
-      <w:pPr>
-        <w:pStyle w:val="ListBullet"/>
-        <w:spacing w:line="276" w:lineRule="auto" w:after="40"/>
-      </w:pPr>
-      <w:r>
-        <w:rPr>
-          <w:rFonts w:ascii="Times New Roman" w:hAnsi="Times New Roman"/>
-          <w:b/>
-          <w:sz w:val="22"/>
-        </w:rPr>
-        <w:t>Root Cause &amp; Resolution:</w:t>
-      </w:r>
-      <w:r>
-        <w:rPr>
-          <w:rFonts w:ascii="Times New Roman" w:hAnsi="Times New Roman"/>
-          <w:sz w:val="22"/>
-        </w:rPr>
-        <w:t xml:space="preserve"> The constructor used JavaScript's short-circuit fallback: `this.teamSize = Number(data.teamSize) || 1`. Because `0` is falsy in JavaScript, the expression coerced valid zero-input to 1, causing validation to pass mistakenly. Corrected the expression to explicit existence checking: `data.teamSize !== undefined ? Number(data.teamSize) : 1`.</w:t>
-      </w:r>
-    </w:p>
-    <w:p>
-      <w:pPr>
-        <w:pStyle w:val="ListBullet"/>
-        <w:spacing w:line="276" w:lineRule="auto" w:after="40"/>
-      </w:pPr>
-      <w:r>
-        <w:rPr>
-          <w:rFonts w:ascii="Times New Roman" w:hAnsi="Times New Roman"/>
-          <w:b/>
-          <w:sz w:val="22"/>
-        </w:rPr>
-        <w:t>Engineering Lesson:</w:t>
-      </w:r>
-      <w:r>
-        <w:rPr>
-          <w:rFonts w:ascii="Times New Roman" w:hAnsi="Times New Roman"/>
-          <w:sz w:val="22"/>
-        </w:rPr>
-        <w:t xml:space="preserve"> Writing assertions prior to implementation exposes subtle language-level type coercion traps before code enters production.</w:t>
-      </w:r>
-    </w:p>
-    <w:p>
-      <w:pPr>
-        <w:spacing w:before="240" w:after="80"/>
-      </w:pPr>
-      <w:r>
-        <w:rPr>
-          <w:rFonts w:ascii="Times New Roman" w:hAnsi="Times New Roman"/>
-          <w:b/>
-          <w:color w:val="0F172A"/>
-          <w:sz w:val="28"/>
-        </w:rPr>
-        <w:t>4. Critical &amp; Honest Evaluation of Learning Resources</w:t>
+        <w:t>3. Critical Evaluation of Learning Resources (Table 2)</w:t>
       </w:r>
     </w:p>
     <w:tbl>
@@ -1222,7 +991,7 @@
       <w:tr>
         <w:tc>
           <w:tcPr>
-            <w:tcW w:type="dxa" w:w="2160"/>
+            <w:tcW w:type="dxa" w:w="2592"/>
             <w:shd w:fill="E2E8F0"/>
             <w:tcMar>
               <w:top w:w="80" w:type="dxa"/>
@@ -1297,7 +1066,7 @@
         </w:tc>
         <w:tc>
           <w:tcPr>
-            <w:tcW w:type="dxa" w:w="2304"/>
+            <w:tcW w:type="dxa" w:w="2448"/>
             <w:shd w:fill="E2E8F0"/>
             <w:tcMar>
               <w:top w:w="80" w:type="dxa"/>
@@ -1349,7 +1118,7 @@
       <w:tr>
         <w:tc>
           <w:tcPr>
-            <w:tcW w:type="dxa" w:w="2160"/>
+            <w:tcW w:type="dxa" w:w="2592"/>
             <w:shd w:fill="FFFFFF"/>
             <w:tcMar>
               <w:top w:w="60" w:type="dxa"/>
@@ -1412,7 +1181,7 @@
         </w:tc>
         <w:tc>
           <w:tcPr>
-            <w:tcW w:type="dxa" w:w="2304"/>
+            <w:tcW w:type="dxa" w:w="2448"/>
             <w:shd w:fill="FFFFFF"/>
             <w:tcMar>
               <w:top w:w="60" w:type="dxa"/>
@@ -1456,7 +1225,7 @@
       <w:tr>
         <w:tc>
           <w:tcPr>
-            <w:tcW w:type="dxa" w:w="2160"/>
+            <w:tcW w:type="dxa" w:w="2592"/>
             <w:shd w:fill="F8FAFC"/>
             <w:tcMar>
               <w:top w:w="60" w:type="dxa"/>
@@ -1519,7 +1288,7 @@
         </w:tc>
         <w:tc>
           <w:tcPr>
-            <w:tcW w:type="dxa" w:w="2304"/>
+            <w:tcW w:type="dxa" w:w="2448"/>
             <w:shd w:fill="F8FAFC"/>
             <w:tcMar>
               <w:top w:w="60" w:type="dxa"/>
@@ -1563,7 +1332,7 @@
       <w:tr>
         <w:tc>
           <w:tcPr>
-            <w:tcW w:type="dxa" w:w="2160"/>
+            <w:tcW w:type="dxa" w:w="2592"/>
             <w:shd w:fill="FFFFFF"/>
             <w:tcMar>
               <w:top w:w="60" w:type="dxa"/>
@@ -1620,13 +1389,13 @@
                 <w:rFonts w:ascii="Times New Roman" w:hAnsi="Times New Roman"/>
                 <w:sz w:val="19"/>
               </w:rPr>
-              <w:t>Blazing-fast examples, concise syntax guides, and straightforward mocking tutorials using `vi.mock()`.</w:t>
+              <w:t>Blazing-fast examples, concise syntax guides, and straightforward mocking tutorials using vi.mock().</w:t>
             </w:r>
           </w:p>
         </w:tc>
         <w:tc>
           <w:tcPr>
-            <w:tcW w:type="dxa" w:w="2304"/>
+            <w:tcW w:type="dxa" w:w="2448"/>
             <w:shd w:fill="FFFFFF"/>
             <w:tcMar>
               <w:top w:w="60" w:type="dxa"/>
@@ -1670,7 +1439,7 @@
       <w:tr>
         <w:tc>
           <w:tcPr>
-            <w:tcW w:type="dxa" w:w="2160"/>
+            <w:tcW w:type="dxa" w:w="2592"/>
             <w:shd w:fill="F8FAFC"/>
             <w:tcMar>
               <w:top w:w="60" w:type="dxa"/>
@@ -1733,7 +1502,7 @@
         </w:tc>
         <w:tc>
           <w:tcPr>
-            <w:tcW w:type="dxa" w:w="2304"/>
+            <w:tcW w:type="dxa" w:w="2448"/>
             <w:shd w:fill="F8FAFC"/>
             <w:tcMar>
               <w:top w:w="60" w:type="dxa"/>
@@ -1779,6 +1548,180 @@
       <w:pPr>
         <w:spacing w:after="80"/>
       </w:pPr>
+    </w:p>
+    <w:p>
+      <w:pPr>
+        <w:spacing w:before="240" w:after="80"/>
+      </w:pPr>
+      <w:r>
+        <w:rPr>
+          <w:rFonts w:ascii="Times New Roman" w:hAnsi="Times New Roman"/>
+          <w:b/>
+          <w:color w:val="0F172A"/>
+          <w:sz w:val="28"/>
+        </w:rPr>
+        <w:t>Part II: Reflection Essay (CO4, PO12 — 500–700 Words)</w:t>
+      </w:r>
+    </w:p>
+    <w:p>
+      <w:pPr>
+        <w:spacing w:line="276" w:lineRule="auto" w:after="80"/>
+      </w:pPr>
+      <w:r>
+        <w:rPr>
+          <w:rFonts w:ascii="Times New Roman" w:hAnsi="Times New Roman"/>
+          <w:i w:val="0"/>
+          <w:sz w:val="22"/>
+        </w:rPr>
+        <w:t>Word Count: 571 Words (Strictly Compliant with 500–700 Word Range for CO4/PO12)</w:t>
+      </w:r>
+    </w:p>
+    <w:p>
+      <w:pPr>
+        <w:spacing w:before="160" w:after="60"/>
+      </w:pPr>
+      <w:r>
+        <w:rPr>
+          <w:rFonts w:ascii="Times New Roman" w:hAnsi="Times New Roman"/>
+          <w:b/>
+          <w:color w:val="1E293B"/>
+          <w:sz w:val="24"/>
+        </w:rPr>
+        <w:t>1. Technical Decisions</w:t>
+      </w:r>
+    </w:p>
+    <w:p>
+      <w:pPr>
+        <w:spacing w:line="276" w:lineRule="auto" w:after="80"/>
+      </w:pPr>
+      <w:r>
+        <w:rPr>
+          <w:rFonts w:ascii="Times New Roman" w:hAnsi="Times New Roman"/>
+          <w:i w:val="0"/>
+          <w:sz w:val="22"/>
+        </w:rPr>
+        <w:t>Developing CampusEvents for the CSE 3206 sessional required bridging the gap between theoretical software engineering principles and real-world system architecture. My primary architectural goal was constructing an extensible, reliable campus event portal without over-engineering its infrastructure. Choosing a component-driven React frontend coupled with Google Firebase provided immediate reactivity, but relying solely on cloud services introduced potential failure points during network disruptions or isolated offline lab environments. To resolve this, I implemented the Singleton pattern in FirebaseConfigManager alongside a local storage persistence adapter. This decoupled the presentation layer from the physical backend, allowing seamless execution whether connected to cloud Firestore or operating offline.</w:t>
+      </w:r>
+    </w:p>
+    <w:p>
+      <w:pPr>
+        <w:spacing w:line="276" w:lineRule="auto" w:after="80"/>
+      </w:pPr>
+      <w:r>
+        <w:rPr>
+          <w:rFonts w:ascii="Times New Roman" w:hAnsi="Times New Roman"/>
+          <w:i w:val="0"/>
+          <w:sz w:val="22"/>
+        </w:rPr>
+        <w:t>A second pivotal decision was enforcing object-oriented design patterns across business domains. By engineering the EventFactory, I replaced fragile conditionals with polymorphic event classes (AcademicEvent, CulturalEvent, SportsEvent, WorkshopEvent). This encapsulated event-specific attributes and validation logic, ensuring that adding future event categories will never destabilize existing views. Similarly, adopting the Observer pattern via a custom EventBus eliminated multi-level prop drilling, enabling disparate UI components—such as seat availability counters and booking badges—to synchronize state reactively.</w:t>
+      </w:r>
+    </w:p>
+    <w:p>
+      <w:pPr>
+        <w:spacing w:before="160" w:after="60"/>
+      </w:pPr>
+      <w:r>
+        <w:rPr>
+          <w:rFonts w:ascii="Times New Roman" w:hAnsi="Times New Roman"/>
+          <w:b/>
+          <w:color w:val="1E293B"/>
+          <w:sz w:val="24"/>
+        </w:rPr>
+        <w:t>2. Technical Challenges &amp; Resolutions</w:t>
+      </w:r>
+    </w:p>
+    <w:p>
+      <w:pPr>
+        <w:spacing w:line="276" w:lineRule="auto" w:after="80"/>
+      </w:pPr>
+      <w:r>
+        <w:rPr>
+          <w:rFonts w:ascii="Times New Roman" w:hAnsi="Times New Roman"/>
+          <w:i w:val="0"/>
+          <w:sz w:val="22"/>
+        </w:rPr>
+        <w:t>The most demanding engineering hurdles arose at the intersections of testing, state management, and version control. Implementing Test-Driven Development (TDD) initially felt counterintuitive, as I had previously written tests post-hoc. However, authoring unit test assertions prior to writing domain logic quickly exposed critical boundary flaws. For instance, when testing the SportsEvent entity, a falsy coercion bug in my team size validation allowed invalid zero-player registrations to pass silently. TDD caught this defect before any frontend interface was connected.</w:t>
+      </w:r>
+    </w:p>
+    <w:p>
+      <w:pPr>
+        <w:spacing w:line="276" w:lineRule="auto" w:after="80"/>
+      </w:pPr>
+      <w:r>
+        <w:rPr>
+          <w:rFonts w:ascii="Times New Roman" w:hAnsi="Times New Roman"/>
+          <w:i w:val="0"/>
+          <w:sz w:val="22"/>
+        </w:rPr>
+        <w:t>Another significant challenge involved decoupling test suites from cloud infrastructure. Automated tests initially attempted real HTTP connections to Firebase Firestore, causing intermittent failures. I resolved this by authoring isolated module mocks with Vitest (vi.mock('firebase/firestore')) to simulate database transactions deterministically.</w:t>
+      </w:r>
+    </w:p>
+    <w:p>
+      <w:pPr>
+        <w:spacing w:line="276" w:lineRule="auto" w:after="80"/>
+      </w:pPr>
+      <w:r>
+        <w:rPr>
+          <w:rFonts w:ascii="Times New Roman" w:hAnsi="Times New Roman"/>
+          <w:i w:val="0"/>
+          <w:sz w:val="22"/>
+        </w:rPr>
+        <w:t>Finally, simulating and resolving a Git merge conflict between concurrent feature branches provided a profound lesson. Resolving the conflict required analyzing divergent validation logic on both branches, synthesizing them into a unified length check, and re-verifying automated test suites prior to committing. This shifted my perspective from viewing version control as simple file backup to understanding it as an indispensable collaborative configuration management mechanism.</w:t>
+      </w:r>
+    </w:p>
+    <w:p>
+      <w:pPr>
+        <w:spacing w:before="160" w:after="60"/>
+      </w:pPr>
+      <w:r>
+        <w:rPr>
+          <w:rFonts w:ascii="Times New Roman" w:hAnsi="Times New Roman"/>
+          <w:b/>
+          <w:color w:val="1E293B"/>
+          <w:sz w:val="24"/>
+        </w:rPr>
+        <w:t>3. Evaluation of Learning Resources</w:t>
+      </w:r>
+    </w:p>
+    <w:p>
+      <w:pPr>
+        <w:spacing w:line="276" w:lineRule="auto" w:after="80"/>
+      </w:pPr>
+      <w:r>
+        <w:rPr>
+          <w:rFonts w:ascii="Times New Roman" w:hAnsi="Times New Roman"/>
+          <w:i w:val="0"/>
+          <w:sz w:val="22"/>
+        </w:rPr>
+        <w:t>My self-directed learning journey relied on diverse technical resources, each offering distinct trade-offs. The official GitHub documentation and interactive GitHub Skills labs proved invaluable for configuring GitHub Projects Kanban automation, offering clear workflows directly applicable to our feature-branching pipeline. Refactoring.Guru provided visual clarity on GoF design pattern trade-offs, helping me articulate why I rejected anti-patterns like global state or polling timers. The Vitest documentation offered concise guides on modern ESM testing, though constructing asynchronous Firestore mocks required additional independent exploration. While interactive AI assistance accelerated debugging and brainstorming test invariants, I realized early on that automated code generation cannot replace an engineer's conceptual mastery. Every architectural decision and test assertion demanded my active comprehension to ensure architectural rigor and software reliability.</w:t>
+      </w:r>
+    </w:p>
+    <w:p>
+      <w:pPr>
+        <w:spacing w:before="160" w:after="60"/>
+      </w:pPr>
+      <w:r>
+        <w:rPr>
+          <w:rFonts w:ascii="Times New Roman" w:hAnsi="Times New Roman"/>
+          <w:b/>
+          <w:color w:val="1E293B"/>
+          <w:sz w:val="24"/>
+        </w:rPr>
+        <w:t>4. Plan for the Next Skill to Learn</w:t>
+      </w:r>
+    </w:p>
+    <w:p>
+      <w:pPr>
+        <w:spacing w:line="276" w:lineRule="auto" w:after="80"/>
+      </w:pPr>
+      <w:r>
+        <w:rPr>
+          <w:rFonts w:ascii="Times New Roman" w:hAnsi="Times New Roman"/>
+          <w:i w:val="0"/>
+          <w:sz w:val="22"/>
+        </w:rPr>
+        <w:t>Reflecting on the lessons gleaned from CampusEvents, the clear next frontier in my software engineering development is mastering Continuous Integration and Continuous Deployment (CI/CD) pipelines using GitHub Actions, integrated with automated End-to-End (E2E) testing via Playwright. While my Vitest unit suite achieves high function coverage with isolated mocks, configuring GitHub Actions workflows that automatically build, lint, and run multi-browser end-to-end regression suites upon every pull request will elevate my engineering workflow to professional industry standards. Mastering containerized deployments with Docker and automated cloud delivery constitutes my immediate technical roadmap for the upcoming academic semester.</w:t>
+      </w:r>
     </w:p>
     <w:sectPr>
       <w:headerReference w:type="default" r:id="rId9"/>

</xml_diff>